<commit_message>
Support option letters attached directly to preceding word and integrate latest question bank in docx
</commit_message>
<xml_diff>
--- a/mau_cau_hoi.docx
+++ b/mau_cau_hoi.docx
@@ -381,294 +381,6 @@
       <w:r>
         <w:br/>
       </w:r>
-      <w:proofErr w:type="spellStart"/>
-      <w:r>
-        <w:t>Giải</w:t>
-      </w:r>
-      <w:proofErr w:type="spellEnd"/>
-      <w:r>
-        <w:t xml:space="preserve"> </w:t>
-      </w:r>
-      <w:proofErr w:type="spellStart"/>
-      <w:r>
-        <w:t>thích</w:t>
-      </w:r>
-      <w:proofErr w:type="spellEnd"/>
-      <w:r>
-        <w:t xml:space="preserve">: Theo V.I. Lênin, </w:t>
-      </w:r>
-      <w:proofErr w:type="spellStart"/>
-      <w:r>
-        <w:t>giai</w:t>
-      </w:r>
-      <w:proofErr w:type="spellEnd"/>
-      <w:r>
-        <w:t xml:space="preserve"> </w:t>
-      </w:r>
-      <w:proofErr w:type="spellStart"/>
-      <w:r>
-        <w:t>cấp</w:t>
-      </w:r>
-      <w:proofErr w:type="spellEnd"/>
-      <w:r>
-        <w:t xml:space="preserve"> </w:t>
-      </w:r>
-      <w:proofErr w:type="spellStart"/>
-      <w:r>
-        <w:t>là</w:t>
-      </w:r>
-      <w:proofErr w:type="spellEnd"/>
-      <w:r>
-        <w:t xml:space="preserve"> </w:t>
-      </w:r>
-      <w:proofErr w:type="spellStart"/>
-      <w:r>
-        <w:t>những</w:t>
-      </w:r>
-      <w:proofErr w:type="spellEnd"/>
-      <w:r>
-        <w:t xml:space="preserve"> </w:t>
-      </w:r>
-      <w:proofErr w:type="spellStart"/>
-      <w:r>
-        <w:t>tập</w:t>
-      </w:r>
-      <w:proofErr w:type="spellEnd"/>
-      <w:r>
-        <w:t xml:space="preserve"> </w:t>
-      </w:r>
-      <w:proofErr w:type="spellStart"/>
-      <w:r>
-        <w:t>đoàn</w:t>
-      </w:r>
-      <w:proofErr w:type="spellEnd"/>
-      <w:r>
-        <w:t xml:space="preserve"> </w:t>
-      </w:r>
-      <w:proofErr w:type="spellStart"/>
-      <w:r>
-        <w:t>người</w:t>
-      </w:r>
-      <w:proofErr w:type="spellEnd"/>
-      <w:r>
-        <w:t xml:space="preserve"> </w:t>
-      </w:r>
-      <w:proofErr w:type="spellStart"/>
-      <w:r>
-        <w:t>khác</w:t>
-      </w:r>
-      <w:proofErr w:type="spellEnd"/>
-      <w:r>
-        <w:t xml:space="preserve"> </w:t>
-      </w:r>
-      <w:proofErr w:type="spellStart"/>
-      <w:r>
-        <w:t>nhau</w:t>
-      </w:r>
-      <w:proofErr w:type="spellEnd"/>
-      <w:r>
-        <w:t xml:space="preserve"> </w:t>
-      </w:r>
-      <w:proofErr w:type="spellStart"/>
-      <w:r>
-        <w:t>về</w:t>
-      </w:r>
-      <w:proofErr w:type="spellEnd"/>
-      <w:r>
-        <w:t xml:space="preserve"> </w:t>
-      </w:r>
-      <w:proofErr w:type="spellStart"/>
-      <w:r>
-        <w:t>địa</w:t>
-      </w:r>
-      <w:proofErr w:type="spellEnd"/>
-      <w:r>
-        <w:t xml:space="preserve"> </w:t>
-      </w:r>
-      <w:proofErr w:type="spellStart"/>
-      <w:r>
-        <w:t>vị</w:t>
-      </w:r>
-      <w:proofErr w:type="spellEnd"/>
-      <w:r>
-        <w:t xml:space="preserve"> </w:t>
-      </w:r>
-      <w:proofErr w:type="spellStart"/>
-      <w:r>
-        <w:t>trong</w:t>
-      </w:r>
-      <w:proofErr w:type="spellEnd"/>
-      <w:r>
-        <w:t xml:space="preserve"> </w:t>
-      </w:r>
-      <w:proofErr w:type="spellStart"/>
-      <w:r>
-        <w:t>hệ</w:t>
-      </w:r>
-      <w:proofErr w:type="spellEnd"/>
-      <w:r>
-        <w:t xml:space="preserve"> </w:t>
-      </w:r>
-      <w:proofErr w:type="spellStart"/>
-      <w:r>
-        <w:t>thống</w:t>
-      </w:r>
-      <w:proofErr w:type="spellEnd"/>
-      <w:r>
-        <w:t xml:space="preserve"> </w:t>
-      </w:r>
-      <w:proofErr w:type="spellStart"/>
-      <w:r>
-        <w:t>sản</w:t>
-      </w:r>
-      <w:proofErr w:type="spellEnd"/>
-      <w:r>
-        <w:t xml:space="preserve"> </w:t>
-      </w:r>
-      <w:proofErr w:type="spellStart"/>
-      <w:r>
-        <w:t>xuất</w:t>
-      </w:r>
-      <w:proofErr w:type="spellEnd"/>
-      <w:r>
-        <w:t xml:space="preserve"> </w:t>
-      </w:r>
-      <w:proofErr w:type="spellStart"/>
-      <w:r>
-        <w:t>xã</w:t>
-      </w:r>
-      <w:proofErr w:type="spellEnd"/>
-      <w:r>
-        <w:t xml:space="preserve"> </w:t>
-      </w:r>
-      <w:proofErr w:type="spellStart"/>
-      <w:r>
-        <w:t>hội</w:t>
-      </w:r>
-      <w:proofErr w:type="spellEnd"/>
-      <w:r>
-        <w:t xml:space="preserve">, </w:t>
-      </w:r>
-      <w:proofErr w:type="spellStart"/>
-      <w:r>
-        <w:t>quan</w:t>
-      </w:r>
-      <w:proofErr w:type="spellEnd"/>
-      <w:r>
-        <w:t xml:space="preserve"> </w:t>
-      </w:r>
-      <w:proofErr w:type="spellStart"/>
-      <w:r>
-        <w:t>hệ</w:t>
-      </w:r>
-      <w:proofErr w:type="spellEnd"/>
-      <w:r>
-        <w:t xml:space="preserve"> </w:t>
-      </w:r>
-      <w:proofErr w:type="spellStart"/>
-      <w:r>
-        <w:t>với</w:t>
-      </w:r>
-      <w:proofErr w:type="spellEnd"/>
-      <w:r>
-        <w:t xml:space="preserve"> </w:t>
-      </w:r>
-      <w:proofErr w:type="spellStart"/>
-      <w:r>
-        <w:t>tư</w:t>
-      </w:r>
-      <w:proofErr w:type="spellEnd"/>
-      <w:r>
-        <w:t xml:space="preserve"> </w:t>
-      </w:r>
-      <w:proofErr w:type="spellStart"/>
-      <w:r>
-        <w:t>liệu</w:t>
-      </w:r>
-      <w:proofErr w:type="spellEnd"/>
-      <w:r>
-        <w:t xml:space="preserve"> </w:t>
-      </w:r>
-      <w:proofErr w:type="spellStart"/>
-      <w:r>
-        <w:t>sản</w:t>
-      </w:r>
-      <w:proofErr w:type="spellEnd"/>
-      <w:r>
-        <w:t xml:space="preserve"> </w:t>
-      </w:r>
-      <w:proofErr w:type="spellStart"/>
-      <w:r>
-        <w:t>xuất</w:t>
-      </w:r>
-      <w:proofErr w:type="spellEnd"/>
-      <w:r>
-        <w:t xml:space="preserve"> </w:t>
-      </w:r>
-      <w:proofErr w:type="spellStart"/>
-      <w:r>
-        <w:t>và</w:t>
-      </w:r>
-      <w:proofErr w:type="spellEnd"/>
-      <w:r>
-        <w:t xml:space="preserve"> </w:t>
-      </w:r>
-      <w:proofErr w:type="spellStart"/>
-      <w:r>
-        <w:t>cách</w:t>
-      </w:r>
-      <w:proofErr w:type="spellEnd"/>
-      <w:r>
-        <w:t xml:space="preserve"> </w:t>
-      </w:r>
-      <w:proofErr w:type="spellStart"/>
-      <w:r>
-        <w:t>hưởng</w:t>
-      </w:r>
-      <w:proofErr w:type="spellEnd"/>
-      <w:r>
-        <w:t xml:space="preserve"> </w:t>
-      </w:r>
-      <w:proofErr w:type="spellStart"/>
-      <w:r>
-        <w:t>thụ</w:t>
-      </w:r>
-      <w:proofErr w:type="spellEnd"/>
-      <w:r>
-        <w:t xml:space="preserve"> </w:t>
-      </w:r>
-      <w:proofErr w:type="spellStart"/>
-      <w:r>
-        <w:t>của</w:t>
-      </w:r>
-      <w:proofErr w:type="spellEnd"/>
-      <w:r>
-        <w:t xml:space="preserve"> </w:t>
-      </w:r>
-      <w:proofErr w:type="spellStart"/>
-      <w:r>
-        <w:t>cải</w:t>
-      </w:r>
-      <w:proofErr w:type="spellEnd"/>
-      <w:r>
-        <w:t xml:space="preserve"> </w:t>
-      </w:r>
-      <w:proofErr w:type="spellStart"/>
-      <w:r>
-        <w:t>xã</w:t>
-      </w:r>
-      <w:proofErr w:type="spellEnd"/>
-      <w:r>
-        <w:t xml:space="preserve"> </w:t>
-      </w:r>
-      <w:proofErr w:type="spellStart"/>
-      <w:r>
-        <w:t>hội</w:t>
-      </w:r>
-      <w:proofErr w:type="spellEnd"/>
-      <w:r>
-        <w:t>.</w:t>
-      </w:r>
     </w:p>
     <w:p>
       <w:proofErr w:type="spellStart"/>
@@ -765,15 +477,7 @@
       </w:r>
       <w:proofErr w:type="spellEnd"/>
       <w:r>
-        <w:t xml:space="preserve"> </w:t>
-      </w:r>
-      <w:proofErr w:type="spellStart"/>
-      <w:r>
-        <w:t>gì</w:t>
-      </w:r>
-      <w:proofErr w:type="spellEnd"/>
-      <w:r>
-        <w:t>?</w:t>
+        <w:t xml:space="preserve"> gì?</w:t>
       </w:r>
       <w:r>
         <w:br/>
@@ -2552,53 +2256,51 @@
       <w:proofErr w:type="spellEnd"/>
       <w:r>
         <w:br/>
-      </w:r>
+        <w:t xml:space="preserve">D. Quan </w:t>
+      </w:r>
+      <w:proofErr w:type="spellStart"/>
+      <w:r>
+        <w:t>hệ</w:t>
+      </w:r>
+      <w:proofErr w:type="spellEnd"/>
+      <w:r>
+        <w:t xml:space="preserve"> </w:t>
+      </w:r>
+      <w:proofErr w:type="spellStart"/>
+      <w:r>
+        <w:t>cạnh</w:t>
+      </w:r>
+      <w:proofErr w:type="spellEnd"/>
+      <w:r>
+        <w:t xml:space="preserve"> </w:t>
+      </w:r>
+      <w:proofErr w:type="spellStart"/>
+      <w:r>
+        <w:t>tranh</w:t>
+      </w:r>
+      <w:proofErr w:type="spellEnd"/>
+      <w:r>
+        <w:t xml:space="preserve"> </w:t>
+      </w:r>
+      <w:proofErr w:type="spellStart"/>
+      <w:r>
+        <w:t>học</w:t>
+      </w:r>
+      <w:proofErr w:type="spellEnd"/>
+      <w:r>
+        <w:t xml:space="preserve"> </w:t>
+      </w:r>
+      <w:proofErr w:type="spellStart"/>
+      <w:r>
+        <w:t>thuật</w:t>
+      </w:r>
+      <w:proofErr w:type="spellEnd"/>
+      <w:r>
+        <w:br/>
+      </w:r>
+      <w:proofErr w:type="spellStart"/>
       <w:r>
         <w:lastRenderedPageBreak/>
-        <w:t xml:space="preserve">D. Quan </w:t>
-      </w:r>
-      <w:proofErr w:type="spellStart"/>
-      <w:r>
-        <w:t>hệ</w:t>
-      </w:r>
-      <w:proofErr w:type="spellEnd"/>
-      <w:r>
-        <w:t xml:space="preserve"> </w:t>
-      </w:r>
-      <w:proofErr w:type="spellStart"/>
-      <w:r>
-        <w:t>cạnh</w:t>
-      </w:r>
-      <w:proofErr w:type="spellEnd"/>
-      <w:r>
-        <w:t xml:space="preserve"> </w:t>
-      </w:r>
-      <w:proofErr w:type="spellStart"/>
-      <w:r>
-        <w:t>tranh</w:t>
-      </w:r>
-      <w:proofErr w:type="spellEnd"/>
-      <w:r>
-        <w:t xml:space="preserve"> </w:t>
-      </w:r>
-      <w:proofErr w:type="spellStart"/>
-      <w:r>
-        <w:t>học</w:t>
-      </w:r>
-      <w:proofErr w:type="spellEnd"/>
-      <w:r>
-        <w:t xml:space="preserve"> </w:t>
-      </w:r>
-      <w:proofErr w:type="spellStart"/>
-      <w:r>
-        <w:t>thuật</w:t>
-      </w:r>
-      <w:proofErr w:type="spellEnd"/>
-      <w:r>
-        <w:br/>
-      </w:r>
-      <w:proofErr w:type="spellStart"/>
-      <w:r>
         <w:t>Đáp</w:t>
       </w:r>
       <w:proofErr w:type="spellEnd"/>
@@ -7185,15 +6887,7 @@
       </w:r>
       <w:proofErr w:type="spellEnd"/>
       <w:r>
-        <w:t xml:space="preserve"> </w:t>
-      </w:r>
-      <w:proofErr w:type="spellStart"/>
-      <w:r>
-        <w:t>gì</w:t>
-      </w:r>
-      <w:proofErr w:type="spellEnd"/>
-      <w:r>
-        <w:t>?</w:t>
+        <w:t xml:space="preserve"> gì?</w:t>
       </w:r>
       <w:r>
         <w:br/>
@@ -10974,6 +10668,7 @@
   <w:style w:type="character" w:default="1" w:styleId="Phngmcinhcuaoanvn">
     <w:name w:val="Default Paragraph Font"/>
     <w:uiPriority w:val="1"/>
+    <w:semiHidden/>
     <w:unhideWhenUsed/>
   </w:style>
   <w:style w:type="table" w:default="1" w:styleId="BangThngthng">

</xml_diff>